<commit_message>
fix links and extend education block
</commit_message>
<xml_diff>
--- a/cv/CV.docx
+++ b/cv/CV.docx
@@ -1,6 +1,6 @@
 
 <file path=word/document.xml><?xml version="1.0" encoding="utf-8"?>
-<w:document xmlns:wpc="http://schemas.microsoft.com/office/word/2010/wordprocessingCanvas" xmlns:mc="http://schemas.openxmlformats.org/markup-compatibility/2006" xmlns:o="urn:schemas-microsoft-com:office:office" xmlns:r="http://schemas.openxmlformats.org/officeDocument/2006/relationships" xmlns:m="http://schemas.openxmlformats.org/officeDocument/2006/math" xmlns:v="urn:schemas-microsoft-com:vml" xmlns:wp14="http://schemas.microsoft.com/office/word/2010/wordprocessingDrawing" xmlns:wp="http://schemas.openxmlformats.org/drawingml/2006/wordprocessingDrawing" xmlns:w="http://schemas.openxmlformats.org/wordprocessingml/2006/main" xmlns:w14="http://schemas.microsoft.com/office/word/2010/wordml" xmlns:w10="urn:schemas-microsoft-com:office:word" xmlns:w15="http://schemas.microsoft.com/office/word/2012/wordml" xmlns:wpg="http://schemas.microsoft.com/office/word/2010/wordprocessingGroup" xmlns:wpi="http://schemas.microsoft.com/office/word/2010/wordprocessingInk" xmlns:wne="http://schemas.microsoft.com/office/word/2006/wordml" xmlns:wps="http://schemas.microsoft.com/office/word/2010/wordprocessingShape" xmlns:wpsCustomData="http://www.wps.cn/officeDocument/2013/wpsCustomData" mc:Ignorable="w14 w15 wp14">
+<w:document xmlns:wpc="http://schemas.microsoft.com/office/word/2010/wordprocessingCanvas" xmlns:cx="http://schemas.microsoft.com/office/drawing/2014/chartex" xmlns:cx1="http://schemas.microsoft.com/office/drawing/2015/9/8/chartex" xmlns:cx2="http://schemas.microsoft.com/office/drawing/2015/10/21/chartex" xmlns:cx3="http://schemas.microsoft.com/office/drawing/2016/5/9/chartex" xmlns:cx4="http://schemas.microsoft.com/office/drawing/2016/5/10/chartex" xmlns:cx5="http://schemas.microsoft.com/office/drawing/2016/5/11/chartex" xmlns:cx6="http://schemas.microsoft.com/office/drawing/2016/5/12/chartex" xmlns:cx7="http://schemas.microsoft.com/office/drawing/2016/5/13/chartex" xmlns:cx8="http://schemas.microsoft.com/office/drawing/2016/5/14/chartex" xmlns:mc="http://schemas.openxmlformats.org/markup-compatibility/2006" xmlns:o="urn:schemas-microsoft-com:office:office" xmlns:r="http://schemas.openxmlformats.org/officeDocument/2006/relationships" xmlns:m="http://schemas.openxmlformats.org/officeDocument/2006/math" xmlns:v="urn:schemas-microsoft-com:vml" xmlns:wp14="http://schemas.microsoft.com/office/word/2010/wordprocessingDrawing" xmlns:wp="http://schemas.openxmlformats.org/drawingml/2006/wordprocessingDrawing" xmlns:w="http://schemas.openxmlformats.org/wordprocessingml/2006/main" xmlns:w14="http://schemas.microsoft.com/office/word/2010/wordml" xmlns:w10="urn:schemas-microsoft-com:office:word" xmlns:w15="http://schemas.microsoft.com/office/word/2012/wordml" xmlns:wpg="http://schemas.microsoft.com/office/word/2010/wordprocessingGroup" xmlns:wpi="http://schemas.microsoft.com/office/word/2010/wordprocessingInk" xmlns:wne="http://schemas.microsoft.com/office/word/2006/wordml" xmlns:wps="http://schemas.microsoft.com/office/word/2010/wordprocessingShape" xmlns:wpsCustomData="http://www.wps.cn/officeDocument/2013/wpsCustomData" mc:Ignorable="w14 w15 wp14">
   <w:background w:color="FFFFFF"/>
   <w:body>
     <w:tbl>
@@ -17,8 +17,8 @@
         </w:tblCellMar>
       </w:tblPr>
       <w:tblGrid>
-        <w:gridCol w:w="7560"/>
-        <w:gridCol w:w="2902"/>
+        <w:gridCol w:w="7616"/>
+        <w:gridCol w:w="2846"/>
       </w:tblGrid>
       <w:tr>
         <w:tc>
@@ -166,7 +166,7 @@
           <w:tbl>
             <w:tblPr>
               <w:tblStyle w:val="9"/>
-              <w:tblW w:w="7029" w:type="dxa"/>
+              <w:tblW w:w="7229" w:type="dxa"/>
               <w:tblInd w:w="0" w:type="dxa"/>
               <w:tblLayout w:type="autofit"/>
               <w:tblCellMar>
@@ -178,7 +178,7 @@
             </w:tblPr>
             <w:tblGrid>
               <w:gridCol w:w="214"/>
-              <w:gridCol w:w="6815"/>
+              <w:gridCol w:w="7015"/>
             </w:tblGrid>
             <w:tr>
               <w:tc>
@@ -247,7 +247,7 @@
               </w:tc>
               <w:tc>
                 <w:tcPr>
-                  <w:tcW w:w="6815" w:type="dxa"/>
+                  <w:tcW w:w="7015" w:type="dxa"/>
                   <w:vAlign w:val="center"/>
                 </w:tcPr>
                 <w:p>
@@ -353,7 +353,7 @@
               </w:tc>
               <w:tc>
                 <w:tcPr>
-                  <w:tcW w:w="6815" w:type="dxa"/>
+                  <w:tcW w:w="7015" w:type="dxa"/>
                   <w:vAlign w:val="center"/>
                 </w:tcPr>
                 <w:p>
@@ -521,9 +521,12 @@
                 <w:p>
                   <w:pPr>
                     <w:pStyle w:val="3"/>
-                  </w:pPr>
-                  <w:r>
-                    <w:rPr>
+                    <w:ind w:left="0" w:leftChars="0"/>
+                    <w:jc w:val="left"/>
+                  </w:pPr>
+                  <w:r>
+                    <w:rPr>
+                      <w:w w:val="100"/>
                       <w:sz w:val="20"/>
                       <w:szCs w:val="20"/>
                     </w:rPr>
@@ -531,14 +534,35 @@
                   </w:r>
                   <w:r>
                     <w:rPr>
+                      <w:w w:val="100"/>
                       <w:sz w:val="20"/>
                       <w:szCs w:val="20"/>
                       <w:lang w:val="en-US"/>
                     </w:rPr>
-                    <w:t xml:space="preserve"> and Ambassador</w:t>
-                  </w:r>
-                  <w:r>
-                    <w:rPr>
+                    <w:t xml:space="preserve"> and</w:t>
+                  </w:r>
+                  <w:r>
+                    <w:rPr>
+                      <w:rFonts w:hint="default"/>
+                      <w:w w:val="100"/>
+                      <w:sz w:val="20"/>
+                      <w:szCs w:val="20"/>
+                      <w:lang w:val="en-US"/>
+                    </w:rPr>
+                    <w:t xml:space="preserve"> </w:t>
+                  </w:r>
+                  <w:r>
+                    <w:rPr>
+                      <w:w w:val="100"/>
+                      <w:sz w:val="20"/>
+                      <w:szCs w:val="20"/>
+                      <w:lang w:val="en-US"/>
+                    </w:rPr>
+                    <w:t>Ambassador</w:t>
+                  </w:r>
+                  <w:r>
+                    <w:rPr>
+                      <w:w w:val="100"/>
                       <w:sz w:val="20"/>
                       <w:szCs w:val="20"/>
                     </w:rPr>
@@ -1251,7 +1275,7 @@
               </w:tc>
               <w:tc>
                 <w:tcPr>
-                  <w:tcW w:w="6815" w:type="dxa"/>
+                  <w:tcW w:w="7015" w:type="dxa"/>
                   <w:vAlign w:val="center"/>
                 </w:tcPr>
                 <w:p>
@@ -1821,6 +1845,7 @@
           <w:p>
             <w:pPr>
               <w:pStyle w:val="27"/>
+              <w:spacing w:line="240" w:lineRule="auto"/>
               <w:rPr>
                 <w:sz w:val="18"/>
                 <w:szCs w:val="18"/>
@@ -1837,12 +1862,35 @@
           <w:p>
             <w:pPr>
               <w:pStyle w:val="27"/>
+              <w:keepNext w:val="0"/>
+              <w:keepLines w:val="0"/>
+              <w:pageBreakBefore w:val="0"/>
+              <w:widowControl/>
+              <w:kinsoku/>
+              <w:wordWrap/>
+              <w:overflowPunct/>
+              <w:topLinePunct w:val="0"/>
+              <w:autoSpaceDE/>
+              <w:autoSpaceDN/>
+              <w:bidi w:val="0"/>
+              <w:adjustRightInd/>
+              <w:snapToGrid/>
+              <w:spacing w:before="100" w:line="240" w:lineRule="auto"/>
+              <w:textAlignment w:val="auto"/>
               <w:rPr>
                 <w:sz w:val="18"/>
                 <w:szCs w:val="18"/>
-                <w:lang w:val="en-US"/>
               </w:rPr>
             </w:pPr>
+            <w:r>
+              <w:fldChar w:fldCharType="begin"/>
+            </w:r>
+            <w:r>
+              <w:instrText xml:space="preserve"> HYPERLINK "tel:+79308106722" \h </w:instrText>
+            </w:r>
+            <w:r>
+              <w:fldChar w:fldCharType="separate"/>
+            </w:r>
             <w:r>
               <w:rPr>
                 <w:sz w:val="18"/>
@@ -1850,20 +1898,43 @@
               </w:rPr>
               <w:t>+79308106722</w:t>
             </w:r>
+            <w:r>
+              <w:rPr>
+                <w:sz w:val="18"/>
+                <w:szCs w:val="18"/>
+              </w:rPr>
+              <w:fldChar w:fldCharType="end"/>
+            </w:r>
           </w:p>
           <w:p>
             <w:pPr>
               <w:pStyle w:val="26"/>
+              <w:keepNext w:val="0"/>
+              <w:keepLines w:val="0"/>
+              <w:pageBreakBefore w:val="0"/>
+              <w:widowControl/>
+              <w:kinsoku/>
+              <w:wordWrap/>
+              <w:overflowPunct/>
+              <w:topLinePunct w:val="0"/>
+              <w:autoSpaceDE/>
+              <w:autoSpaceDN/>
+              <w:bidi w:val="0"/>
+              <w:adjustRightInd/>
+              <w:snapToGrid/>
+              <w:spacing w:before="73" w:beforeLines="20"/>
+              <w:textAlignment w:val="auto"/>
               <w:rPr>
-                <w:sz w:val="20"/>
-                <w:szCs w:val="20"/>
+                <w:rStyle w:val="16"/>
+                <w:sz w:val="18"/>
+                <w:szCs w:val="18"/>
               </w:rPr>
             </w:pPr>
             <w:r>
               <w:fldChar w:fldCharType="begin"/>
             </w:r>
             <w:r>
-              <w:instrText xml:space="preserve"> HYPERLINK "mailto:daniil.d.parshin@mail.ru" </w:instrText>
+              <w:instrText xml:space="preserve"> HYPERLINK "mailto:daniil.d.parshin@mail.ru" \h </w:instrText>
             </w:r>
             <w:r>
               <w:fldChar w:fldCharType="separate"/>
@@ -1888,10 +1959,7 @@
           <w:p>
             <w:pPr>
               <w:pStyle w:val="4"/>
-              <w:rPr>
-                <w:sz w:val="20"/>
-                <w:szCs w:val="20"/>
-              </w:rPr>
+              <w:spacing w:line="360" w:lineRule="auto"/>
             </w:pPr>
             <w:r>
               <w:rPr>
@@ -1903,35 +1971,19 @@
           </w:p>
           <w:p>
             <w:pPr>
-              <w:pStyle w:val="27"/>
+              <w:pStyle w:val="26"/>
               <w:rPr>
                 <w:sz w:val="18"/>
                 <w:szCs w:val="18"/>
-                <w:lang w:val="en-US"/>
               </w:rPr>
             </w:pPr>
             <w:r>
-              <w:rPr>
-                <w:sz w:val="18"/>
-                <w:szCs w:val="18"/>
-                <w:lang w:val="en-US"/>
-              </w:rPr>
               <w:fldChar w:fldCharType="begin"/>
             </w:r>
             <w:r>
-              <w:rPr>
-                <w:sz w:val="18"/>
-                <w:szCs w:val="18"/>
-                <w:lang w:val="en-US"/>
-              </w:rPr>
-              <w:instrText xml:space="preserve"> HYPERLINK "https://github.com/De-Par" </w:instrText>
+              <w:instrText xml:space="preserve"> HYPERLINK "https://github.com/De-Par" \h </w:instrText>
             </w:r>
             <w:r>
-              <w:rPr>
-                <w:sz w:val="18"/>
-                <w:szCs w:val="18"/>
-                <w:lang w:val="en-US"/>
-              </w:rPr>
               <w:fldChar w:fldCharType="separate"/>
             </w:r>
             <w:r>
@@ -1939,15 +1991,14 @@
                 <w:rStyle w:val="16"/>
                 <w:sz w:val="18"/>
                 <w:szCs w:val="18"/>
-                <w:lang w:val="en-US"/>
               </w:rPr>
-              <w:t>https://github.com/De-Par</w:t>
+              <w:t>GitHub</w:t>
             </w:r>
             <w:r>
               <w:rPr>
+                <w:rStyle w:val="16"/>
                 <w:sz w:val="18"/>
                 <w:szCs w:val="18"/>
-                <w:lang w:val="en-US"/>
               </w:rPr>
               <w:fldChar w:fldCharType="end"/>
             </w:r>
@@ -1961,24 +2012,12 @@
               </w:rPr>
             </w:pPr>
             <w:r>
-              <w:rPr>
-                <w:sz w:val="18"/>
-                <w:szCs w:val="18"/>
-              </w:rPr>
               <w:fldChar w:fldCharType="begin"/>
             </w:r>
             <w:r>
-              <w:rPr>
-                <w:sz w:val="18"/>
-                <w:szCs w:val="18"/>
-              </w:rPr>
-              <w:instrText xml:space="preserve"> HYPERLINK "https://t.me/de_par" </w:instrText>
+              <w:instrText xml:space="preserve"> HYPERLINK "https://t.me/de_par" \h </w:instrText>
             </w:r>
             <w:r>
-              <w:rPr>
-                <w:sz w:val="18"/>
-                <w:szCs w:val="18"/>
-              </w:rPr>
               <w:fldChar w:fldCharType="separate"/>
             </w:r>
             <w:r>
@@ -1987,17 +2026,16 @@
                 <w:sz w:val="18"/>
                 <w:szCs w:val="18"/>
               </w:rPr>
-              <w:t>https://t.me/de_par</w:t>
+              <w:t>Telegram</w:t>
             </w:r>
             <w:r>
               <w:rPr>
+                <w:rStyle w:val="16"/>
                 <w:sz w:val="18"/>
                 <w:szCs w:val="18"/>
               </w:rPr>
               <w:fldChar w:fldCharType="end"/>
             </w:r>
-            <w:bookmarkStart w:id="0" w:name="_GoBack"/>
-            <w:bookmarkEnd w:id="0"/>
           </w:p>
           <w:p>
             <w:pPr>
@@ -2014,6 +2052,8 @@
               </w:rPr>
               <w:t>Technical Skills</w:t>
             </w:r>
+            <w:bookmarkStart w:id="0" w:name="_GoBack"/>
+            <w:bookmarkEnd w:id="0"/>
           </w:p>
           <w:p>
             <w:pPr>
@@ -2267,8 +2307,8 @@
               </w:tblCellMar>
             </w:tblPr>
             <w:tblGrid>
-              <w:gridCol w:w="501"/>
-              <w:gridCol w:w="2342"/>
+              <w:gridCol w:w="500"/>
+              <w:gridCol w:w="2336"/>
             </w:tblGrid>
             <w:tr>
               <w:trPr>
@@ -2433,7 +2473,6 @@
                       <w:color w:val="0070C0"/>
                       <w:sz w:val="24"/>
                       <w:szCs w:val="24"/>
-                      <w:lang w:val="en-US"/>
                     </w:rPr>
                   </w:pPr>
                   <w:r>
@@ -2443,6 +2482,102 @@
                       <w:szCs w:val="24"/>
                     </w:rPr>
                     <w:t>Education</w:t>
+                  </w:r>
+                </w:p>
+                <w:p>
+                  <w:pPr>
+                    <w:pStyle w:val="3"/>
+                    <w:rPr>
+                      <w:sz w:val="20"/>
+                      <w:szCs w:val="20"/>
+                      <w:lang w:val="en-US"/>
+                    </w:rPr>
+                  </w:pPr>
+                  <w:r>
+                    <w:rPr>
+                      <w:sz w:val="20"/>
+                      <w:szCs w:val="20"/>
+                    </w:rPr>
+                    <w:t>HSE University — Nizhny Novgorod</w:t>
+                  </w:r>
+                  <w:r>
+                    <w:rPr>
+                      <w:sz w:val="20"/>
+                      <w:szCs w:val="20"/>
+                      <w:lang w:val="en-US"/>
+                    </w:rPr>
+                    <w:t>, Russia</w:t>
+                  </w:r>
+                </w:p>
+                <w:p>
+                  <w:pPr>
+                    <w:pStyle w:val="10"/>
+                    <w:rPr>
+                      <w:rFonts w:hint="default"/>
+                      <w:lang w:val="en-US"/>
+                    </w:rPr>
+                  </w:pPr>
+                  <w:r>
+                    <w:t>September 202</w:t>
+                  </w:r>
+                  <w:r>
+                    <w:rPr>
+                      <w:rFonts w:hint="default"/>
+                      <w:lang w:val="en-US"/>
+                    </w:rPr>
+                    <w:t>6</w:t>
+                  </w:r>
+                  <w:r>
+                    <w:t xml:space="preserve"> — </w:t>
+                  </w:r>
+                  <w:r>
+                    <w:rPr>
+                      <w:rFonts w:hint="default"/>
+                      <w:lang w:val="en-US"/>
+                    </w:rPr>
+                    <w:t>Present</w:t>
+                  </w:r>
+                </w:p>
+                <w:p>
+                  <w:pPr>
+                    <w:rPr>
+                      <w:rFonts w:hint="default"/>
+                      <w:lang w:val="en-US"/>
+                    </w:rPr>
+                  </w:pPr>
+                  <w:r>
+                    <w:rPr>
+                      <w:rFonts w:hint="default"/>
+                      <w:sz w:val="18"/>
+                      <w:szCs w:val="18"/>
+                      <w:lang w:val="en-US"/>
+                    </w:rPr>
+                    <w:t>Master</w:t>
+                  </w:r>
+                  <w:r>
+                    <w:rPr>
+                      <w:sz w:val="18"/>
+                      <w:szCs w:val="18"/>
+                    </w:rPr>
+                    <w:t>’s Degree in Applied Mathematics and Information Science</w:t>
+                  </w:r>
+                  <w:r>
+                    <w:rPr>
+                      <w:rFonts w:hint="default"/>
+                      <w:sz w:val="18"/>
+                      <w:szCs w:val="18"/>
+                      <w:lang w:val="ru-RU"/>
+                    </w:rPr>
+                    <w:t xml:space="preserve"> </w:t>
+                  </w:r>
+                  <w:r>
+                    <w:rPr>
+                      <w:rFonts w:hint="default"/>
+                      <w:sz w:val="18"/>
+                      <w:szCs w:val="18"/>
+                      <w:lang w:val="en-US"/>
+                    </w:rPr>
+                    <w:t>| Program: Data Mining</w:t>
                   </w:r>
                 </w:p>
                 <w:p>
@@ -4170,7 +4305,7 @@
 </file>
 
 <file path=customXml/item1.xml><?xml version="1.0" encoding="utf-8"?>
-<b:Sources xmlns="http://schemas.openxmlformats.org/officeDocument/2006/bibliography" xmlns:b="http://schemas.openxmlformats.org/officeDocument/2006/bibliography" Version="6" StyleName="APA" SelectedStyle="/APASixthEditionOfficeOnline.xsl"/>
+<b:Sources xmlns="http://schemas.openxmlformats.org/officeDocument/2006/bibliography" xmlns:b="http://schemas.openxmlformats.org/officeDocument/2006/bibliography" Version="6" SelectedStyle="/APASixthEditionOfficeOnline.xsl" StyleName="APA"/>
 </file>
 
 <file path=customXml/itemProps1.xml><?xml version="1.0" encoding="utf-8"?>

</xml_diff>

<commit_message>
chore: cleanup layout and extend skills
</commit_message>
<xml_diff>
--- a/cv/CV.docx
+++ b/cv/CV.docx
@@ -302,7 +302,8 @@
                 <w:b w:val="0"/>
                 <w:i w:val="0"/>
                 <w:color w:val="3C3E43"/>
-                <w:sz w:val="18"/>
+                <w:sz w:val="16"/>
+                <w:szCs w:val="21"/>
               </w:rPr>
               <w:t>C++ Software Engineer focused on systems and performance engineering on Linux. I develop and optimize performance-sensitive C/C++ and Python software for profiling, graphics, and CPU inference, with hands-on experience in multithreading, benchmarking, build systems, CI/CD, debugging, and automated testing.</w:t>
             </w:r>
@@ -1994,21 +1995,7 @@
                 <w:szCs w:val="14"/>
                 <w:lang w:val="en-US"/>
               </w:rPr>
-              <w:t>; algorithm</w:t>
-            </w:r>
-            <w:bookmarkStart w:id="0" w:name="_GoBack"/>
-            <w:bookmarkEnd w:id="0"/>
-            <w:r>
-              <w:rPr>
-                <w:rFonts w:hint="default" w:eastAsia="Source Sans 3"/>
-                <w:b w:val="0"/>
-                <w:i w:val="0"/>
-                <w:color w:val="3C3E43"/>
-                <w:sz w:val="14"/>
-                <w:szCs w:val="14"/>
-                <w:lang w:val="en-US"/>
-              </w:rPr>
-              <w:t>s &amp; data structures</w:t>
+              <w:t>; algorithms &amp; data structures</w:t>
             </w:r>
           </w:p>
           <w:p>
@@ -2074,6 +2061,14 @@
             <w:pPr>
               <w:widowControl/>
               <w:spacing w:before="0" w:after="80" w:line="226" w:lineRule="exact"/>
+              <w:rPr>
+                <w:rFonts w:ascii="Source Sans 3" w:hAnsi="Source Sans 3" w:eastAsia="Source Sans 3"/>
+                <w:b w:val="0"/>
+                <w:i w:val="0"/>
+                <w:color w:val="3C3E43"/>
+                <w:sz w:val="14"/>
+                <w:szCs w:val="14"/>
+              </w:rPr>
             </w:pPr>
             <w:r>
               <w:rPr>
@@ -2108,6 +2103,72 @@
                 <w:szCs w:val="14"/>
               </w:rPr>
               <w:t>GTest, Robot Framework</w:t>
+            </w:r>
+            <w:bookmarkStart w:id="0" w:name="_GoBack"/>
+            <w:bookmarkEnd w:id="0"/>
+          </w:p>
+          <w:p>
+            <w:pPr>
+              <w:keepNext/>
+              <w:widowControl/>
+              <w:spacing w:before="0" w:after="20" w:line="204" w:lineRule="exact"/>
+              <w:rPr>
+                <w:rFonts w:hint="default"/>
+                <w:sz w:val="15"/>
+                <w:szCs w:val="15"/>
+                <w:lang w:val="en-US"/>
+              </w:rPr>
+            </w:pPr>
+            <w:r>
+              <w:rPr>
+                <w:rFonts w:hint="default" w:eastAsia="Source Sans 3"/>
+                <w:b/>
+                <w:i w:val="0"/>
+                <w:color w:val="0B101C"/>
+                <w:sz w:val="15"/>
+                <w:szCs w:val="15"/>
+                <w:lang w:val="en-US"/>
+              </w:rPr>
+              <w:t>Tools &amp; Collaboration</w:t>
+            </w:r>
+          </w:p>
+          <w:p>
+            <w:pPr>
+              <w:widowControl/>
+              <w:spacing w:before="0" w:after="80" w:line="226" w:lineRule="exact"/>
+              <w:rPr>
+                <w:rFonts w:hint="default" w:ascii="Source Sans 3" w:hAnsi="Source Sans 3" w:eastAsia="Source Sans 3"/>
+                <w:b w:val="0"/>
+                <w:i w:val="0"/>
+                <w:color w:val="3C3E43"/>
+                <w:sz w:val="14"/>
+                <w:szCs w:val="14"/>
+                <w:lang w:val="ru-RU"/>
+              </w:rPr>
+            </w:pPr>
+            <w:r>
+              <w:rPr>
+                <w:rFonts w:hint="default" w:eastAsia="Source Sans 3"/>
+                <w:b w:val="0"/>
+                <w:i w:val="0"/>
+                <w:color w:val="3C3E43"/>
+                <w:sz w:val="14"/>
+                <w:szCs w:val="14"/>
+                <w:lang w:val="en-US"/>
+              </w:rPr>
+              <w:t>Jira, Confluence</w:t>
+            </w:r>
+            <w:r>
+              <w:rPr>
+                <w:rFonts w:hint="default" w:eastAsia="Source Sans 3"/>
+                <w:b w:val="0"/>
+                <w:i w:val="0"/>
+                <w:color w:val="3C3E43"/>
+                <w:sz w:val="14"/>
+                <w:szCs w:val="14"/>
+                <w:lang w:val="ru-RU"/>
+              </w:rPr>
+              <w:t>, Agile (Scrum / Kanban)</w:t>
             </w:r>
           </w:p>
           <w:p>
@@ -3512,8 +3573,6 @@
         <w:ind w:left="259"/>
         <w:rPr>
           <w:rFonts w:hint="default"/>
-          <w:sz w:val="16"/>
-          <w:szCs w:val="16"/>
           <w:lang w:val="en-US"/>
         </w:rPr>
       </w:pPr>
@@ -3564,105 +3623,6 @@
           <w:lang w:val="en-US"/>
         </w:rPr>
         <w:t>Python, faster-whisper, Transformers, FastAPI.</w:t>
-      </w:r>
-    </w:p>
-    <w:p>
-      <w:pPr>
-        <w:keepNext/>
-        <w:widowControl/>
-        <w:spacing w:before="100" w:after="30" w:line="240" w:lineRule="exact"/>
-        <w:ind w:left="259"/>
-        <w:rPr>
-          <w:rFonts w:hint="default"/>
-          <w:sz w:val="18"/>
-          <w:szCs w:val="18"/>
-          <w:lang w:val="en-US"/>
-        </w:rPr>
-      </w:pPr>
-      <w:r>
-        <w:rPr>
-          <w:rFonts w:ascii="Source Sans 3" w:hAnsi="Source Sans 3" w:eastAsia="Source Sans 3"/>
-          <w:b/>
-          <w:i w:val="0"/>
-          <w:color w:val="0B101C"/>
-          <w:sz w:val="18"/>
-          <w:szCs w:val="18"/>
-        </w:rPr>
-        <w:t>Convex Polygon Intersection Calculator</w:t>
-      </w:r>
-      <w:r>
-        <w:rPr>
-          <w:rFonts w:hint="default" w:eastAsia="Source Sans 3"/>
-          <w:b/>
-          <w:i w:val="0"/>
-          <w:color w:val="0B101C"/>
-          <w:sz w:val="18"/>
-          <w:szCs w:val="18"/>
-          <w:lang w:val="en-US"/>
-        </w:rPr>
-        <w:t xml:space="preserve"> | </w:t>
-      </w:r>
-      <w:r>
-        <w:rPr>
-          <w:sz w:val="16"/>
-          <w:szCs w:val="21"/>
-        </w:rPr>
-        <w:fldChar w:fldCharType="begin"/>
-      </w:r>
-      <w:r>
-        <w:rPr>
-          <w:sz w:val="16"/>
-          <w:szCs w:val="21"/>
-        </w:rPr>
-        <w:instrText xml:space="preserve"> HYPERLINK "https://github.com/De-Par/Polygons_area_intersection" \h </w:instrText>
-      </w:r>
-      <w:r>
-        <w:rPr>
-          <w:sz w:val="16"/>
-          <w:szCs w:val="21"/>
-        </w:rPr>
-        <w:fldChar w:fldCharType="separate"/>
-      </w:r>
-      <w:r>
-        <w:rPr>
-          <w:rFonts w:ascii="Source Sans 3" w:hAnsi="Source Sans 3"/>
-          <w:color w:val="22A860"/>
-          <w:sz w:val="16"/>
-          <w:szCs w:val="16"/>
-        </w:rPr>
-        <w:t>GitHub</w:t>
-      </w:r>
-      <w:r>
-        <w:rPr>
-          <w:rFonts w:ascii="Source Sans 3" w:hAnsi="Source Sans 3"/>
-          <w:color w:val="22A860"/>
-          <w:sz w:val="16"/>
-          <w:szCs w:val="16"/>
-        </w:rPr>
-        <w:fldChar w:fldCharType="end"/>
-      </w:r>
-    </w:p>
-    <w:p>
-      <w:pPr>
-        <w:widowControl/>
-        <w:spacing w:before="0" w:after="100" w:line="268" w:lineRule="exact"/>
-        <w:ind w:left="259"/>
-        <w:rPr>
-          <w:rFonts w:hint="default"/>
-          <w:lang w:val="en-US"/>
-        </w:rPr>
-      </w:pPr>
-      <w:r>
-        <w:rPr>
-          <w:rFonts w:hint="default" w:eastAsia="Source Sans 3"/>
-          <w:b w:val="0"/>
-          <w:i w:val="0"/>
-          <w:color w:val="3C3E43"/>
-          <w:sz w:val="16"/>
-          <w:szCs w:val="21"/>
-          <w:lang w:val="en-US"/>
-        </w:rPr>
-        <w:t>GUI application for computing intersections of convex polygons. Stack: C++, Qt.</w:t>
       </w:r>
     </w:p>
     <w:p>
@@ -17659,7 +17619,7 @@
 </file>
 
 <file path=customXml/item1.xml><?xml version="1.0" encoding="utf-8"?>
-<b:Sources xmlns:b="http://schemas.openxmlformats.org/officeDocument/2006/bibliography" xmlns="http://schemas.openxmlformats.org/officeDocument/2006/bibliography" SelectedStyle="/APA.XSL" StyleName="APA"/>
+<b:Sources xmlns="http://schemas.openxmlformats.org/officeDocument/2006/bibliography" xmlns:b="http://schemas.openxmlformats.org/officeDocument/2006/bibliography" SelectedStyle="/APA.XSL" StyleName="APA"/>
 </file>
 
 <file path=customXml/itemProps1.xml><?xml version="1.0" encoding="utf-8"?>

</xml_diff>